<commit_message>
feat: publish secured cloud demo deployment
</commit_message>
<xml_diff>
--- a/提交材料/02_技术架构、核心代码与关键技术选型说明.docx
+++ b/提交材料/02_技术架构、核心代码与关键技术选型说明.docx
@@ -306,7 +306,7 @@
           </w:tcPr>
           <w:p>
             <w:r>
-              <w:t>2026年8月16日</w:t>
+              <w:t>2026年8月17日</w:t>
             </w:r>
           </w:p>
         </w:tc>
@@ -1317,7 +1317,7 @@
                 <w:color w:val="000000"/>
                 <w:sz w:val="17"/>
               </w:rPr>
-              <w:t>90题种子与版本</w:t>
+              <w:t>96题种子与版本</w:t>
             </w:r>
           </w:p>
         </w:tc>

</xml_diff>